<commit_message>
Retirar modo estrito, explicar funções e rever relatório Word
</commit_message>
<xml_diff>
--- a/relatorio/Relatorio_Searching.docx
+++ b/relatorio/Relatorio_Searching.docx
@@ -203,7 +203,7 @@
     </w:p>
     <w:p>
       <w:r>
-        <w:t>Cada página dinâmica possui o seu ficheiro JavaScript. As funções comuns, como obter dados, formatar valores e apresentar mensagens de erro, estão reunidas em utils.js. As descrições e as fotografias das regiões estão organizadas em regioes.js.</w:t>
+        <w:t>Cada página dinâmica possui o seu ficheiro JavaScript, com funções tradicionais declaradas através de function. Os ficheiros são carregados com defer, para executar o código depois de o HTML estar disponível. As funções comuns, como obter dados, formatar valores e apresentar mensagens de erro, estão reunidas em utils.js. As descrições e as fotografias das regiões estão organizadas em regioes.js.</w:t>
       </w:r>
     </w:p>
     <w:p>
@@ -213,7 +213,7 @@
     </w:p>
     <w:p>
       <w:r>
-        <w:t>Foram utilizados arrays de objetos, estruturas de decisão e ciclos. Métodos como filter, sort, find e forEach permitem pesquisar regiões, ordenar resultados, encontrar informações e criar os cartões.</w:t>
+        <w:t>Foram utilizados arrays de objetos para organizar as regiões e os seus conteúdos. Os ciclos for percorrem as listas e criam os cartões, enquanto as condições if/else permitem pesquisar regiões, validar dados e tratar situações sem informação. A ordenação alfabética utiliza o método sort().</w:t>
       </w:r>
     </w:p>
     <w:p>

</xml_diff>